<commit_message>
nouvelle page mode admin + rajout de vin + bdd pour les presta
Co-authored-by: Copilot <copilot@github.com>
</commit_message>
<xml_diff>
--- a/projet.docx
+++ b/projet.docx
@@ -107,6 +107,65 @@
         <w:t xml:space="preserve"> server</w:t>
       </w:r>
     </w:p>
+    <w:p/>
+    <w:p>
+      <w:r>
+        <w:t xml:space="preserve">Prestation : </w:t>
+      </w:r>
+    </w:p>
+    <w:p>
+      <w:pPr>
+        <w:pStyle w:val="Paragraphedeliste"/>
+        <w:numPr>
+          <w:ilvl w:val="0"/>
+          <w:numId w:val="1"/>
+        </w:numPr>
+      </w:pPr>
+      <w:r>
+        <w:t xml:space="preserve">Visiter une cave / </w:t>
+      </w:r>
+      <w:proofErr w:type="spellStart"/>
+      <w:r>
+        <w:t>degustation</w:t>
+      </w:r>
+      <w:proofErr w:type="spellEnd"/>
+    </w:p>
+    <w:p>
+      <w:pPr>
+        <w:pStyle w:val="Paragraphedeliste"/>
+        <w:numPr>
+          <w:ilvl w:val="0"/>
+          <w:numId w:val="1"/>
+        </w:numPr>
+      </w:pPr>
+      <w:proofErr w:type="spellStart"/>
+      <w:r>
+        <w:t>Degustation</w:t>
+      </w:r>
+      <w:proofErr w:type="spellEnd"/>
+      <w:r>
+        <w:t xml:space="preserve"> a </w:t>
+      </w:r>
+      <w:proofErr w:type="spellStart"/>
+      <w:r>
+        <w:t>domiciel</w:t>
+      </w:r>
+      <w:proofErr w:type="spellEnd"/>
+    </w:p>
+    <w:p>
+      <w:pPr>
+        <w:pStyle w:val="Paragraphedeliste"/>
+        <w:numPr>
+          <w:ilvl w:val="0"/>
+          <w:numId w:val="1"/>
+        </w:numPr>
+      </w:pPr>
+      <w:r>
+        <w:t>Ateliers de Dégustation</w:t>
+      </w:r>
+    </w:p>
+    <w:p/>
+    <w:p/>
     <w:p/>
     <w:p>
       <w:pPr>
@@ -984,7 +1043,6 @@
   <w:style w:type="character" w:default="1" w:styleId="Policepardfaut">
     <w:name w:val="Default Paragraph Font"/>
     <w:uiPriority w:val="1"/>
-    <w:semiHidden/>
     <w:unhideWhenUsed/>
   </w:style>
   <w:style w:type="table" w:default="1" w:styleId="TableauNormal">

</xml_diff>